<commit_message>
Actualizar Guia y Word de Sustentacion con los 9 titulos separados
</commit_message>
<xml_diff>
--- a/Guia_Vilcacoto_Sustentacion.docx
+++ b/Guia_Vilcacoto_Sustentacion.docx
@@ -96,65 +96,116 @@
         <w:pStyle w:val="Heading2"/>
       </w:pPr>
       <w:r>
-        <w:t xml:space="preserve">Módulo 1 y 2: Entrada y Descarga (Realidad Peruana)</w:t>
-      </w:r>
-    </w:p>
-    <w:p>
-      <w:r>
-        <w:t xml:space="preserve">Ejemplo: Llega el Volquete ABC-123. Registra 18.5 Ton brutos y 8.5 Ton vacíos. El sistema saca 10 Ton Netas. En el módulo 2, lo asignamos a la "Plataforma de Descarga General", adaptándonos a que los camiones traen basura mezclada.</w:t>
-      </w:r>
-    </w:p>
-    <w:p>
-      <w:pPr>
-        <w:pStyle w:val="Heading2"/>
-      </w:pPr>
-      <w:r>
-        <w:t xml:space="preserve">Módulo 3 y 4: Recuperación</w:t>
-      </w:r>
-    </w:p>
-    <w:p>
-      <w:r>
-        <w:t xml:space="preserve">Ejemplo: De la plataforma general, los operarios logran separar 1.5 Ton de Plástico PET en el Módulo 3. Si ocupa mucho espacio, pasa al Módulo 4 donde se registra que las trituradoras procesaron esas 1.5 Ton, controlando así las máquinas.</w:t>
-      </w:r>
-    </w:p>
-    <w:p>
-      <w:pPr>
-        <w:pStyle w:val="Heading2"/>
-      </w:pPr>
-      <w:r>
-        <w:t xml:space="preserve">Módulo 5 y 6: Transformación</w:t>
-      </w:r>
-    </w:p>
-    <w:p>
-      <w:r>
-        <w:t xml:space="preserve">Ejemplo: La materia orgánica se registra en la bitácora del Módulo 5 (ej. 65°C de temperatura del compost). La basura no aprovechable va a la prensa en el Módulo 6, donde 4 Toneladas se compactan en solo 2 metros cúbicos (m3).</w:t>
-      </w:r>
-    </w:p>
-    <w:p>
-      <w:pPr>
-        <w:pStyle w:val="Heading2"/>
-      </w:pPr>
-      <w:r>
-        <w:t xml:space="preserve">Módulo 7 y 8: Negocios y Ambiente</w:t>
-      </w:r>
-    </w:p>
-    <w:p>
-      <w:r>
-        <w:t xml:space="preserve">Ejemplo Negocio (Mod 7): El plástico triturado va directamente al "Almacén Principal". El área de ventas ve este stock en tiempo real. 
-Ejemplo Ambiental (Mod 8): Se registran parámetros como el pH (7.2) de los líquidos lixiviados para cumplir con el Ministerio del Ambiente.</w:t>
-      </w:r>
-    </w:p>
-    <w:p>
-      <w:pPr>
-        <w:pStyle w:val="Heading2"/>
-      </w:pPr>
-      <w:r>
-        <w:t xml:space="preserve">Módulo 9: Cierre</w:t>
-      </w:r>
-    </w:p>
-    <w:p>
-      <w:r>
-        <w:t xml:space="preserve">Ejemplo: El camión XYZ-987 se lleva los 2 metros cúbicos de basura inservible y compactada al Relleno Sanitario Municipal. Aquí el ciclo se cierra de manera formal.</w:t>
+        <w:t xml:space="preserve">1. Recepción y Pesaje</w:t>
+      </w:r>
+    </w:p>
+    <w:p>
+      <w:r>
+        <w:t xml:space="preserve">Todo inicia en la balanza. Simulamos que llega un Volquete. Registramos 18.5 Toneladas brutos y 8.5 Ton de tara. El sistema calcula automáticamente 10 Toneladas Netas.</w:t>
+      </w:r>
+    </w:p>
+    <w:p>
+      <w:pPr>
+        <w:pStyle w:val="Heading2"/>
+      </w:pPr>
+      <w:r>
+        <w:t xml:space="preserve">2. Descarga Temporal</w:t>
+      </w:r>
+    </w:p>
+    <w:p>
+      <w:r>
+        <w:t xml:space="preserve">Adaptándonos a la realidad peruana donde la basura llega mezclada en el camión, asignamos este vehículo directamente a la Plataforma de Descarga General.</w:t>
+      </w:r>
+    </w:p>
+    <w:p>
+      <w:pPr>
+        <w:pStyle w:val="Heading2"/>
+      </w:pPr>
+      <w:r>
+        <w:t xml:space="preserve">3. Segregación</w:t>
+      </w:r>
+    </w:p>
+    <w:p>
+      <w:r>
+        <w:t xml:space="preserve">Los operarios separan el material en las fajas. Ingresamos al sistema lo que logramos rescatar: por ejemplo, 1.5 Toneladas de Plástico PET y 7 Toneladas de orgánicos.</w:t>
+      </w:r>
+    </w:p>
+    <w:p>
+      <w:pPr>
+        <w:pStyle w:val="Heading2"/>
+      </w:pPr>
+      <w:r>
+        <w:t xml:space="preserve">4. Trituración</w:t>
+      </w:r>
+    </w:p>
+    <w:p>
+      <w:r>
+        <w:t xml:space="preserve">Si ese PET ocupa mucho espacio, pasa por la trituradora. Aquí registramos que procesamos 1.5 Toneladas de plástico para calcular el desgaste de la máquina.</w:t>
+      </w:r>
+    </w:p>
+    <w:p>
+      <w:pPr>
+        <w:pStyle w:val="Heading2"/>
+      </w:pPr>
+      <w:r>
+        <w:t xml:space="preserve">5. Tratamiento Orgánico</w:t>
+      </w:r>
+    </w:p>
+    <w:p>
+      <w:r>
+        <w:t xml:space="preserve">La materia orgánica (7 Toneladas) va al compostaje. El sistema obliga a registrar una bitácora de su Temperatura y Humedad (ej. 65°C).</w:t>
+      </w:r>
+    </w:p>
+    <w:p>
+      <w:pPr>
+        <w:pStyle w:val="Heading2"/>
+      </w:pPr>
+      <w:r>
+        <w:t xml:space="preserve">6. Compactación</w:t>
+      </w:r>
+    </w:p>
+    <w:p>
+      <w:r>
+        <w:t xml:space="preserve">La basura inservible va a la prensa. Aquí registramos que 4 Toneladas de basura se aplastaron hasta dejarlas en solo 2 metros cúbicos (m3).</w:t>
+      </w:r>
+    </w:p>
+    <w:p>
+      <w:pPr>
+        <w:pStyle w:val="Heading2"/>
+      </w:pPr>
+      <w:r>
+        <w:t xml:space="preserve">7. Materiales Reciclables</w:t>
+      </w:r>
+    </w:p>
+    <w:p>
+      <w:r>
+        <w:t xml:space="preserve">Módulo de Negocios. El plástico triturado y el compost se envían al sistema como stock al Almacén Principal para que el área de ventas pueda comercializarlo.</w:t>
+      </w:r>
+    </w:p>
+    <w:p>
+      <w:pPr>
+        <w:pStyle w:val="Heading2"/>
+      </w:pPr>
+      <w:r>
+        <w:t xml:space="preserve">8. Tratamiento Lixiviados</w:t>
+      </w:r>
+    </w:p>
+    <w:p>
+      <w:r>
+        <w:t xml:space="preserve">Módulo Ambiental. La basura bota jugo tóxico. El software obliga a registrar parámetros como el pH (ej. 7.2) y DBO para evitar clausuras.</w:t>
+      </w:r>
+    </w:p>
+    <w:p>
+      <w:pPr>
+        <w:pStyle w:val="Heading2"/>
+      </w:pPr>
+      <w:r>
+        <w:t xml:space="preserve">9. Disposición Final</w:t>
+      </w:r>
+    </w:p>
+    <w:p>
+      <w:r>
+        <w:t xml:space="preserve">Los cubos compactados que no sirven se van. Registramos que un tráiler se llevó los 2 m3 de rechazo al Relleno Sanitario Municipal. El ciclo de la basura termina oficialmente.</w:t>
       </w:r>
     </w:p>
     <w:p/>
@@ -168,7 +219,7 @@
     </w:p>
     <w:p>
       <w:r>
-        <w:t xml:space="preserve">No es un simple formulario. Es una herramienta de Toma de Decisiones gerenciales que guía a los operarios y transforma toneladas de basura en métricas claras para hacer de Vilcacoto una planta financieramente y ecológicamente sostenible.</w:t>
+        <w:t xml:space="preserve">No hemos construido un simple excel. Hemos construido una herramienta de Toma de Decisiones gerenciales que guía a los operarios y transforma toneladas de basura en métricas claras para hacer de Vilcacoto una planta sostenible.</w:t>
       </w:r>
     </w:p>
     <w:sectPr>

</xml_diff>